<commit_message>
This build enhances and fixes many find provider capabiliites, and upgrades pydantic AI's lib as well as LLM vendor libs and allows for more robust handling of user issues when the applicatoin can not route to a tool.
promote local -> dev (2026-08-26T19:33:00.983647+00:00)
</commit_message>
<xml_diff>
--- a/architecture/ClaudeCodeConversationPersistence/ArchitectureDesignAndAuditDocs/Secret_Management_Architecture_Recommendation.docx
+++ b/architecture/ClaudeCodeConversationPersistence/ArchitectureDesignAndAuditDocs/Secret_Management_Architecture_Recommendation.docx
@@ -4,6 +4,242 @@
   <w:body>
     <w:p>
       <w:pPr>
+        <w:pStyle w:val="Heading1"/>
+      </w:pPr>
+      <w:r>
+        <w:rPr>
+          <w:color w:val="008080"/>
+        </w:rPr>
+        <w:t>0. Status of this document</w:t>
+      </w:r>
+    </w:p>
+    <w:p>
+      <w:pPr/>
+      <w:r>
+        <w:rPr>
+          <w:color w:val="008080"/>
+        </w:rPr>
+        <w:t>Sections 1 through 12 are superseded. They describe a pipeline that was replaced, and a secret that is no longer held. They are retained because they record what was decided and why, and are marked section by section below. Section 13 is current. Everything in teal was written against the system as built.</w:t>
+      </w:r>
+    </w:p>
+    <w:p>
+      <w:pPr>
+        <w:pStyle w:val="Heading2"/>
+      </w:pPr>
+      <w:r>
+        <w:rPr>
+          <w:color w:val="008080"/>
+        </w:rPr>
+        <w:t>0.1 What changed</w:t>
+      </w:r>
+    </w:p>
+    <w:p>
+      <w:pPr/>
+      <w:r>
+        <w:rPr>
+          <w:color w:val="008080"/>
+        </w:rPr>
+        <w:t>The subject of Part A no longer exists. This document recommends storing MONGO_FRONTEND_connectionString in HKLM with an ACL. Mongo authentication is now X.509 mutual TLS: the certificate is the credential, it is issued to a named identity, and it is read from Azure Key Vault under that identity's own name. There is no connection string, no password and no machine-scope environment variable, so there is nothing for Sections 4, 5, 10 and 12 to secure, rotate or migrate. The pipeline's own source carries no occurrence of the name.</w:t>
+      </w:r>
+    </w:p>
+    <w:p>
+      <w:pPr/>
+      <w:r>
+        <w:rPr>
+          <w:color w:val="008080"/>
+        </w:rPr>
+        <w:t>Kafka and the HTTP producer sidecar were removed on 2026-08-07. They were two additional components that could be down, and both were, while adding nothing a local filesystem does not already provide for a single workstation. The spool is now the queue: durable, with an explicit acknowledgement, because a spool file is deleted only after MongoDB confirms the write.</w:t>
+      </w:r>
+    </w:p>
+    <w:p>
+      <w:pPr>
+        <w:pStyle w:val="Heading2"/>
+      </w:pPr>
+      <w:r>
+        <w:rPr>
+          <w:color w:val="008080"/>
+        </w:rPr>
+        <w:t>0.2 The pipeline as built</w:t>
+      </w:r>
+    </w:p>
+    <w:p>
+      <w:pPr>
+        <w:pStyle w:val="ListBullet"/>
+      </w:pPr>
+      <w:r>
+        <w:rPr>
+          <w:color w:val="008080"/>
+        </w:rPr>
+        <w:t>A hook writes. On UserPromptSubmit and on Stop, conversation_log_writer.py writes the raw payload to C:/tmp/ChatHealthySpool as write-&lt;guid&gt;-&lt;time_ns&gt;.txt and renames it in place to read-&lt;guid&gt;-&lt;time_ns&gt;.txt. The rename is what makes a file visible only once it is complete. The writer parses nothing and opens no network connection, so no remote outage can slow or fail an utterance.</w:t>
+      </w:r>
+    </w:p>
+    <w:p>
+      <w:pPr>
+        <w:pStyle w:val="ListBullet"/>
+      </w:pPr>
+      <w:r>
+        <w:rPr>
+          <w:color w:val="008080"/>
+        </w:rPr>
+        <w:t>A drain ships. conversation_log_drain.py polls the spool every 5 seconds, one file at a time, and deletes each only after the insert is acknowledged. Batching would be faster and would make a mid-batch failure ambiguous about which files had landed. It is a single Python child, not two.</w:t>
+      </w:r>
+    </w:p>
+    <w:p>
+      <w:pPr>
+        <w:pStyle w:val="ListBullet"/>
+      </w:pPr>
+      <w:r>
+        <w:rPr>
+          <w:color w:val="008080"/>
+        </w:rPr>
+        <w:t>A record is built and redacted. conversation_log_record.py decides who spoke from the payload's shape, removes credentials against both stores per Section 13, and removes profanity with a model.</w:t>
+      </w:r>
+    </w:p>
+    <w:p>
+      <w:pPr>
+        <w:pStyle w:val="ListBullet"/>
+      </w:pPr>
+      <w:r>
+        <w:rPr>
+          <w:color w:val="008080"/>
+        </w:rPr>
+        <w:t>A sweep classifies. Once a day the drain spawns a pass that labels what ingest could not, and checks for credentials as belt and suspenders.</w:t>
+      </w:r>
+    </w:p>
+    <w:p>
+      <w:pPr>
+        <w:pStyle w:val="ListBullet"/>
+      </w:pPr>
+      <w:r>
+        <w:rPr>
+          <w:color w:val="008080"/>
+        </w:rPr>
+        <w:t>A supervisor keeps it alive. The C# Windows Service in Worker.cs and Program.cs starts the drain from CHATHEALTHY_PROJECT_ROOT using the repository's own .venv interpreter, and restarts it 5 seconds after it dies. The project is ClaudeCodeConversationPersistenceService.csproj.</w:t>
+      </w:r>
+    </w:p>
+    <w:p>
+      <w:pPr>
+        <w:pStyle w:val="Heading2"/>
+      </w:pPr>
+      <w:r>
+        <w:rPr>
+          <w:color w:val="008080"/>
+        </w:rPr>
+        <w:t>0.3 Corrected facts</w:t>
+      </w:r>
+    </w:p>
+    <w:p>
+      <w:pPr>
+        <w:pStyle w:val="ListBullet"/>
+      </w:pPr>
+      <w:r>
+        <w:rPr>
+          <w:color w:val="008080"/>
+        </w:rPr>
+        <w:t>Where the document says architecture/Conversation-logPipeline, the path is architecture/ClaudeCodeConversationPersistence.</w:t>
+      </w:r>
+    </w:p>
+    <w:p>
+      <w:pPr>
+        <w:pStyle w:val="ListBullet"/>
+      </w:pPr>
+      <w:r>
+        <w:rPr>
+          <w:color w:val="008080"/>
+        </w:rPr>
+        <w:t>Where it says conversation_log_producer.py and conversation_log_consumer.py, neither file exists. The current files are conversation_log_writer.py, conversation_log_drain.py, conversation_log_record.py, conversation_log_sweep.py, conversation_log_alarm.py and conversation_log_classifier.py.</w:t>
+      </w:r>
+    </w:p>
+    <w:p>
+      <w:pPr>
+        <w:pStyle w:val="ListBullet"/>
+      </w:pPr>
+      <w:r>
+        <w:rPr>
+          <w:color w:val="008080"/>
+        </w:rPr>
+        <w:t>Where it says the archive is ClaudeCodeLog.conversation_log_archive, the archive is ClaudeCodeUtterances.utterances, reached as the DevOpsUser identity on the ChatHealthyFrontEnd cluster.</w:t>
+      </w:r>
+    </w:p>
+    <w:p>
+      <w:pPr>
+        <w:pStyle w:val="ListBullet"/>
+      </w:pPr>
+      <w:r>
+        <w:rPr>
+          <w:color w:val="008080"/>
+        </w:rPr>
+        <w:t>Where it says Code/.env, the file is .env at the repository root.</w:t>
+      </w:r>
+    </w:p>
+    <w:p>
+      <w:pPr>
+        <w:pStyle w:val="ListBullet"/>
+      </w:pPr>
+      <w:r>
+        <w:rPr>
+          <w:color w:val="008080"/>
+        </w:rPr>
+        <w:t>Where Section 8 proposes Windows event-log sources and EventIDs 1001 and 1002, that is not the surface. The drain records a failure reason to a marker file under %TEMP% and clears it on any clean pass; the writer reads that marker and raises a full-screen browser page, because the drain runs in Session 0 and is the one component that cannot tell the operator anything. Routine logging goes through ChatHealthyLoggingService to stderr, which the supervisor captures.</w:t>
+      </w:r>
+    </w:p>
+    <w:p>
+      <w:pPr>
+        <w:pStyle w:val="Heading2"/>
+      </w:pPr>
+      <w:r>
+        <w:rPr>
+          <w:color w:val="008080"/>
+        </w:rPr>
+        <w:t>0.4 What survived</w:t>
+      </w:r>
+    </w:p>
+    <w:p>
+      <w:pPr>
+        <w:pStyle w:val="ListBullet"/>
+      </w:pPr>
+      <w:r>
+        <w:rPr>
+          <w:color w:val="008080"/>
+        </w:rPr>
+        <w:t>The threat model in Section 2 still holds, and still governs. It is stated in terms of who can read a secret on this workstation, which is unchanged by the secret becoming a certificate.</w:t>
+      </w:r>
+    </w:p>
+    <w:p>
+      <w:pPr>
+        <w:pStyle w:val="ListBullet"/>
+      </w:pPr>
+      <w:r>
+        <w:rPr>
+          <w:color w:val="008080"/>
+        </w:rPr>
+        <w:t>Section 6's premise holds: a credential failure that no one can see is worse than one that stops the system. Section 13.3 applies the same reasoning to redaction, where a sweep that repairs something is reporting that ingest failed.</w:t>
+      </w:r>
+    </w:p>
+    <w:p>
+      <w:pPr>
+        <w:pStyle w:val="ListBullet"/>
+      </w:pPr>
+      <w:r>
+        <w:rPr>
+          <w:color w:val="008080"/>
+        </w:rPr>
+        <w:t>Section 7.9 is built. The boot compares the consumer error log's line count to a semaphore and reports new lines through additionalContext, per Rule-002 statement 5.</w:t>
+      </w:r>
+    </w:p>
+    <w:p>
+      <w:pPr>
+        <w:pStyle w:val="ListBullet"/>
+      </w:pPr>
+      <w:r>
+        <w:rPr>
+          <w:color w:val="008080"/>
+        </w:rPr>
+        <w:t>Section 11's second bullet is closed. OPENAI_API_KEY is declared under '# Secrets' in .env and is removed from every utterance by the redaction in Section 13.</w:t>
+      </w:r>
+    </w:p>
+    <w:p>
+      <w:pPr>
         <w:pStyle w:val="Title"/>
       </w:pPr>
       <w:r>
@@ -16,6 +252,15 @@
       </w:pPr>
       <w:r>
         <w:t>1. Introduction</w:t>
+      </w:r>
+    </w:p>
+    <w:p>
+      <w:pPr/>
+      <w:r>
+        <w:rPr>
+          <w:color w:val="008080"/>
+        </w:rPr>
+        <w:t>SUPERSEDED. The connection string this section introduces does not exist. Mongo authentication is X.509; see Section 0.</w:t>
       </w:r>
     </w:p>
     <w:p>
@@ -115,6 +360,15 @@
       </w:pPr>
       <w:r>
         <w:t>3. Per-Component Secret Inventory</w:t>
+      </w:r>
+    </w:p>
+    <w:p>
+      <w:pPr/>
+      <w:r>
+        <w:rPr>
+          <w:color w:val="008080"/>
+        </w:rPr>
+        <w:t>SUPERSEDED. The inventory traces two Python children and a Kafka sidecar. There is one child, and no Kafka; see Section 0.2.</w:t>
       </w:r>
     </w:p>
     <w:p>
@@ -545,6 +799,15 @@
       </w:pPr>
       <w:r>
         <w:t>Part A — Secret-Management Recommendation</w:t>
+      </w:r>
+    </w:p>
+    <w:p>
+      <w:pPr/>
+      <w:r>
+        <w:rPr>
+          <w:color w:val="008080"/>
+        </w:rPr>
+        <w:t>SUPERSEDED IN WHOLE. Part A secures a connection string that is not held anywhere. No part of it is implemented and none should be.</w:t>
       </w:r>
     </w:p>
     <w:p>
@@ -1308,6 +1571,15 @@
       </w:r>
     </w:p>
     <w:p>
+      <w:pPr/>
+      <w:r>
+        <w:rPr>
+          <w:color w:val="008080"/>
+        </w:rPr>
+        <w:t>PARTLY SUPERSEDED. The premise holds -- an invisible credential failure is worse than a loud one -- but every file:line below refers to files that no longer exist, and the Kafka offset semantics no longer apply.</w:t>
+      </w:r>
+    </w:p>
+    <w:p>
       <w:pPr>
         <w:pStyle w:val="Heading1"/>
       </w:pPr>
@@ -1937,6 +2209,15 @@
       </w:r>
     </w:p>
     <w:p>
+      <w:pPr/>
+      <w:r>
+        <w:rPr>
+          <w:color w:val="008080"/>
+        </w:rPr>
+        <w:t>SUPERSEDED. The visibility surface is the %TEMP% failure marker and the writer's full-screen browser page, not event-log sources; see Section 0.3.</w:t>
+      </w:r>
+    </w:p>
+    <w:p>
       <w:r>
         <w:t>The conversation-log pipeline runs as a Windows Service, not as a page the operator is looking at. The browser-popup mechanism that covers SharedServices /gate and the FindCare browser flows (audit path A and B) is not available here. Part B's path 7.1 and 7.3 fixes depend on a different visibility surface. This section specifies the three concrete surfaces and their roles.</w:t>
       </w:r>
@@ -2041,6 +2322,15 @@
       </w:r>
     </w:p>
     <w:p>
+      <w:pPr/>
+      <w:r>
+        <w:rPr>
+          <w:color w:val="008080"/>
+        </w:rPr>
+        <w:t>SUPERSEDED. Part A is withdrawn, so the ordering it constrains is moot.</w:t>
+      </w:r>
+    </w:p>
+    <w:p>
       <w:r>
         <w:t>The secret-management migration in Part A cannot be safely deployed until the silent-failure paths in Part B are tightened. Without Part B, the operator will not learn that the rotated credential is bad; rotation is reduced to a hope. State the dependency explicitly:</w:t>
       </w:r>
@@ -2076,6 +2366,15 @@
       </w:r>
     </w:p>
     <w:p>
+      <w:pPr/>
+      <w:r>
+        <w:rPr>
+          <w:color w:val="008080"/>
+        </w:rPr>
+        <w:t>SUPERSEDED. Rotating a connection string is not a procedure this system has. Certificate rotation belongs to EPIC-008-F-014.</w:t>
+      </w:r>
+    </w:p>
+    <w:p>
       <w:r>
         <w:t>Credential rotation is an operational procedure, not an automated code-level concern. After both Part B and Part A are deployed, the rotation flow is: the upstream Atlas credential is rotated; the service fails on its next Mongo call; the failure surfaces per Section 8 (Event Log entry, service restart loop, or boot additionalContext line); the operator updates the registry; the operator restarts the service; the service rereads the registry and injects the new value into the spawned Python children. There is no code-level retry loop, no hot-reload of the secret while the service runs.</w:t>
       </w:r>
@@ -2227,6 +2526,15 @@
       </w:r>
     </w:p>
     <w:p>
+      <w:pPr/>
+      <w:r>
+        <w:rPr>
+          <w:color w:val="008080"/>
+        </w:rPr>
+        <w:t>SUPERSEDED IN WHOLE. The migration moves a secret that is not held into a registry key that is not read.</w:t>
+      </w:r>
+    </w:p>
+    <w:p>
       <w:r>
         <w:t>Run as local Administrator at the workstation. Order matters: Part B's failure-path fixes ship and are validated BEFORE Part A's registry changes are made.</w:t>
       </w:r>
@@ -2944,6 +3252,242 @@
     <w:p>
       <w:r>
         <w:t>If steps 4 and 5 both fire as expected, the rotation-as-operational-response path is verified end-to-end and the migration is complete.</w:t>
+      </w:r>
+    </w:p>
+    <w:p>
+      <w:pPr>
+        <w:pStyle w:val="Heading1"/>
+      </w:pPr>
+      <w:r>
+        <w:rPr>
+          <w:color w:val="008080"/>
+        </w:rPr>
+        <w:t>13. Redaction: what is a secret, and where its value ends</w:t>
+      </w:r>
+    </w:p>
+    <w:p>
+      <w:pPr/>
+      <w:r>
+        <w:rPr>
+          <w:color w:val="008080"/>
+        </w:rPr>
+        <w:t>Sections 1 through 12 concern the one connection-string secret the pipeline consumes. This section concerns a different problem in the same pipeline: removing every secret from the utterances the pipeline archives. It records the design that satisfies EPIC-008-F-013-S-001-REQ-B-005, -B-006 and -B-010. Those requirements are unchanged.</w:t>
+      </w:r>
+    </w:p>
+    <w:p>
+      <w:pPr>
+        <w:pStyle w:val="Heading2"/>
+      </w:pPr>
+      <w:r>
+        <w:rPr>
+          <w:color w:val="008080"/>
+        </w:rPr>
+        <w:t>13.1 Two stores, asked in real time</w:t>
+      </w:r>
+    </w:p>
+    <w:p>
+      <w:pPr/>
+      <w:r>
+        <w:rPr>
+          <w:color w:val="008080"/>
+        </w:rPr>
+        <w:t>Which values are secret is not written down in the redactor and is not written down in a catalogue. It is asked of the two stores that hold secrets, before every batch and at the start of every archive sweep.</w:t>
+      </w:r>
+    </w:p>
+    <w:p>
+      <w:pPr>
+        <w:pStyle w:val="ListBullet"/>
+      </w:pPr>
+      <w:r>
+        <w:rPr>
+          <w:color w:val="008080"/>
+        </w:rPr>
+        <w:t>Code/.env holds the secrets that live locally, and holds their values. It is re-read when it has changed, and every value declared under its '# Secrets' section is removed by exact match wherever it appears.</w:t>
+      </w:r>
+    </w:p>
+    <w:p>
+      <w:pPr>
+        <w:pStyle w:val="ListBullet"/>
+      </w:pPr>
+      <w:r>
+        <w:rPr>
+          <w:color w:val="008080"/>
+        </w:rPr>
+        <w:t>Azure Key Vault holds the rest. The redactor asks it for the names it is holding and removes whatever each name is bound to. It never asks for a value: removing a credential does not require holding it, and an identity able to read all of them in order to redact one would be the widest grant in the estate, held by the component with the least need for it. Listing names requires list and not get.</w:t>
+      </w:r>
+    </w:p>
+    <w:p>
+      <w:pPr/>
+      <w:r>
+        <w:rPr>
+          <w:color w:val="008080"/>
+        </w:rPr>
+        <w:t>Neither store is copied into the other, and neither is copied into code. A secret added to the vault this afternoon is covered this afternoon. The cost of asking is one subprocess call per batch; a cached answer is reused within a batch so that a sweep over the whole archive still asks once.</w:t>
+      </w:r>
+    </w:p>
+    <w:p>
+      <w:pPr/>
+      <w:r>
+        <w:rPr>
+          <w:color w:val="008080"/>
+        </w:rPr>
+        <w:t>The refresh is per batch and not on a timer. A timer leaves a window in which a just-declared secret is archived in the clear, and that window is when it is most likely to happen: pasting a secret is what prompts declaring it.</w:t>
+      </w:r>
+    </w:p>
+    <w:p>
+      <w:pPr/>
+      <w:r>
+        <w:rPr>
+          <w:color w:val="008080"/>
+        </w:rPr>
+        <w:t>A secret name is not a secret. ATLAS-PRIVATE-KEY names a credential without being one, so the name list needs no protection and is kept on disk. When the vault cannot be reached the last answer it gave is used, and nothing fails: names change only when a secret is added, so a list from yesterday redacts today's paste correctly.</w:t>
+      </w:r>
+    </w:p>
+    <w:p>
+      <w:pPr>
+        <w:pStyle w:val="Heading2"/>
+      </w:pPr>
+      <w:r>
+        <w:rPr>
+          <w:color w:val="008080"/>
+        </w:rPr>
+        <w:t>13.2 Three shapes, and where a value ends</w:t>
+      </w:r>
+    </w:p>
+    <w:p>
+      <w:pPr/>
+      <w:r>
+        <w:rPr>
+          <w:color w:val="008080"/>
+        </w:rPr>
+        <w:t>Knowing that a name is bound to a value is not enough to remove the value. The redactor must know where the value ENDS, and a secret arrives in three shapes that end in three different places. Ending a value at the line is correct for one of them; getting it wrong on the other two does not fail loudly, it leaves most of the credential in place while the marker states it was removed.</w:t>
+      </w:r>
+    </w:p>
+    <w:p>
+      <w:pPr>
+        <w:pStyle w:val="ListBullet"/>
+      </w:pPr>
+      <w:r>
+        <w:rPr>
+          <w:color w:val="008080"/>
+        </w:rPr>
+        <w:t>Simple string — a token, a password, a base64-encoded PEM travelling as an environment variable. Ends at the end of the line, or at its closing quote if quoted, honouring a backslash-escaped quote.</w:t>
+      </w:r>
+    </w:p>
+    <w:p>
+      <w:pPr>
+        <w:pStyle w:val="ListBullet"/>
+      </w:pPr>
+      <w:r>
+        <w:rPr>
+          <w:color w:val="008080"/>
+        </w:rPr>
+        <w:t>JSON — an object or array held as one secret. Ends at the delimiter matching the one it opened with, counting depth and skipping delimiters that fall inside its own strings. A value ended at the first comma or colon ends in the middle of the credential.</w:t>
+      </w:r>
+    </w:p>
+    <w:p>
+      <w:pPr>
+        <w:pStyle w:val="ListBullet"/>
+      </w:pPr>
+      <w:r>
+        <w:rPr>
+          <w:color w:val="008080"/>
+        </w:rPr>
+        <w:t>PKI material — a certificate or private key in PEM form. Begins at its BEGIN header and ends at the line carrying its END footer, many lines later. This is the shape most likely to be half-removed: the first line goes and the key stays.</w:t>
+      </w:r>
+    </w:p>
+    <w:p>
+      <w:pPr/>
+      <w:r>
+        <w:rPr>
+          <w:color w:val="008080"/>
+        </w:rPr>
+        <w:t>The redactor recognises formats and never a particular secret. A format tied to a named secret stops working the day that secret is stored differently, and no such name appears in the code.</w:t>
+      </w:r>
+    </w:p>
+    <w:p>
+      <w:pPr/>
+      <w:r>
+        <w:rPr>
+          <w:color w:val="008080"/>
+        </w:rPr>
+        <w:t>A name is matched whole: a longer name that merely contains a secret's name is a different name and is left alone. Both spellings of a name are matched, because Key Vault admits no underscore and ATLAS_PRIVATE_KEY is stored as ATLAS-PRIVATE-KEY; a secret is not less exposed for having been written the other way. A name mentioned without being bound to anything is left alone, which keeps REQ-B-006 satisfied: only the credential is removed, never the sentence around it.</w:t>
+      </w:r>
+    </w:p>
+    <w:p>
+      <w:pPr/>
+      <w:r>
+        <w:rPr>
+          <w:color w:val="008080"/>
+        </w:rPr>
+        <w:t>What replaces the value names the key it came from, per REQ-B-010, so a leak stays actionable without the value surviving: [Sensitive content redacted (key=NAME)].</w:t>
+      </w:r>
+    </w:p>
+    <w:p>
+      <w:pPr>
+        <w:pStyle w:val="Heading2"/>
+      </w:pPr>
+      <w:r>
+        <w:rPr>
+          <w:color w:val="008080"/>
+        </w:rPr>
+        <w:t>13.3 Where the work happens</w:t>
+      </w:r>
+    </w:p>
+    <w:p>
+      <w:pPr/>
+      <w:r>
+        <w:rPr>
+          <w:color w:val="008080"/>
+        </w:rPr>
+        <w:t>Ingest redacts. Every utterance is redacted against both stores before it reaches the archive, and that is the mechanism.</w:t>
+      </w:r>
+    </w:p>
+    <w:p>
+      <w:pPr/>
+      <w:r>
+        <w:rPr>
+          <w:color w:val="008080"/>
+        </w:rPr>
+        <w:t>The archive sweep classifies. Its job is to finish the labelling that ingest could not do while the classifier was unavailable, which an absent classified_at field records and nothing else can find.</w:t>
+      </w:r>
+    </w:p>
+    <w:p>
+      <w:pPr/>
+      <w:r>
+        <w:rPr>
+          <w:color w:val="008080"/>
+        </w:rPr>
+        <w:t>The sweep also checks for secrets, as belt and suspenders. Because it redacts against the same two stores ingest used, anything it finds reached the archive unredacted — so a repair is a defect report about ingest rather than routine housekeeping, and it is reported as a failure.</w:t>
+      </w:r>
+    </w:p>
+    <w:p>
+      <w:pPr>
+        <w:pStyle w:val="Heading2"/>
+      </w:pPr>
+      <w:r>
+        <w:rPr>
+          <w:color w:val="008080"/>
+        </w:rPr>
+        <w:t>13.4 Two facts this design does not settle</w:t>
+      </w:r>
+    </w:p>
+    <w:p>
+      <w:pPr/>
+      <w:r>
+        <w:rPr>
+          <w:color w:val="008080"/>
+        </w:rPr>
+        <w:t>The vault does not say which of its entries are credentials. It holds configuration alongside secrets — a project id, a host name, its own URI, notification addresses — and nothing distinguishes them, so everything it holds is treated as a secret. Key Vault tags could carry that distinction, the way the certificate secrets already carry host and connect-attempt facts, and the source would remain the source.</w:t>
+      </w:r>
+    </w:p>
+    <w:p>
+      <w:pPr/>
+      <w:r>
+        <w:rPr>
+          <w:color w:val="008080"/>
+        </w:rPr>
+        <w:t>Code/.env and deployment_architecture.json disagree about two names. API_TOKEN_MAP and GITHUB_DEPLOY_TOKEN sit under '# SecretSafe' in the former and are declared azure_key_vault in the latter. Reading the vault covers them either way; the disagreement about what they are remains.</w:t>
       </w:r>
     </w:p>
     <w:sectPr>

</xml_diff>